<commit_message>
ajout du moteur de finance
</commit_message>
<xml_diff>
--- a/business-model/Projet n004-26-KYA-Commercialisation-Logiciel-KYA-SolDesign.docx
+++ b/business-model/Projet n004-26-KYA-Commercialisation-Logiciel-KYA-SolDesign.docx
@@ -317,6 +317,7 @@
       </w:tblGrid>
       <w:tr>
         <w:tblPrEx>
+          <w:shd w:val="clear" w:color="auto" w:fill="E2EFD9" w:themeFill="accent6" w:themeFillTint="33"/>
           <w:tblCellMar>
             <w:top w:w="0" w:type="dxa"/>
             <w:left w:w="70" w:type="dxa"/>
@@ -396,89 +397,6 @@
                 <w:szCs w:val="28"/>
               </w:rPr>
               <w:t xml:space="preserve">Commercialisation du logiciel KYA-SolDesign </w:t>
-            </w:r>
-          </w:p>
-        </w:tc>
-      </w:tr>
-      <w:tr>
-        <w:tblPrEx>
-          <w:tblCellMar>
-            <w:top w:w="0" w:type="dxa"/>
-            <w:left w:w="70" w:type="dxa"/>
-            <w:bottom w:w="0" w:type="dxa"/>
-            <w:right w:w="70" w:type="dxa"/>
-          </w:tblCellMar>
-        </w:tblPrEx>
-        <w:trPr>
-          <w:trHeight w:val="741" w:hRule="atLeast"/>
-        </w:trPr>
-        <w:tc>
-          <w:tcPr>
-            <w:tcW w:w="4135" w:type="dxa"/>
-            <w:tcBorders>
-              <w:top w:val="nil"/>
-              <w:left w:val="single" w:color="auto" w:sz="8" w:space="0"/>
-              <w:bottom w:val="single" w:color="auto" w:sz="8" w:space="0"/>
-              <w:right w:val="single" w:color="auto" w:sz="8" w:space="0"/>
-            </w:tcBorders>
-            <w:shd w:val="clear" w:color="auto" w:fill="E2EFD9" w:themeFill="accent6" w:themeFillTint="33"/>
-            <w:noWrap/>
-            <w:vAlign w:val="bottom"/>
-          </w:tcPr>
-          <w:p>
-            <w:pPr>
-              <w:spacing w:after="0" w:line="360" w:lineRule="auto"/>
-              <w:jc w:val="both"/>
-              <w:rPr>
-                <w:rFonts w:ascii="Times New Roman" w:hAnsi="Times New Roman" w:eastAsia="Arial Narrow" w:cs="Times New Roman"/>
-                <w:b/>
-                <w:sz w:val="28"/>
-                <w:szCs w:val="28"/>
-              </w:rPr>
-            </w:pPr>
-            <w:r>
-              <w:rPr>
-                <w:rFonts w:ascii="Times New Roman" w:hAnsi="Times New Roman" w:eastAsia="Arial Narrow" w:cs="Times New Roman"/>
-                <w:b/>
-                <w:sz w:val="28"/>
-                <w:szCs w:val="28"/>
-              </w:rPr>
-              <w:t>Dénomination Sociale</w:t>
-            </w:r>
-          </w:p>
-        </w:tc>
-        <w:tc>
-          <w:tcPr>
-            <w:tcW w:w="5211" w:type="dxa"/>
-            <w:tcBorders>
-              <w:top w:val="nil"/>
-              <w:left w:val="nil"/>
-              <w:bottom w:val="single" w:color="auto" w:sz="8" w:space="0"/>
-              <w:right w:val="single" w:color="auto" w:sz="8" w:space="0"/>
-            </w:tcBorders>
-            <w:shd w:val="clear" w:color="auto" w:fill="E2EFD9" w:themeFill="accent6" w:themeFillTint="33"/>
-            <w:noWrap/>
-            <w:vAlign w:val="bottom"/>
-          </w:tcPr>
-          <w:p>
-            <w:pPr>
-              <w:spacing w:after="0" w:line="360" w:lineRule="auto"/>
-              <w:jc w:val="both"/>
-              <w:rPr>
-                <w:rFonts w:ascii="Times New Roman" w:hAnsi="Times New Roman" w:eastAsia="Arial Narrow" w:cs="Times New Roman"/>
-                <w:bCs/>
-                <w:sz w:val="28"/>
-                <w:szCs w:val="28"/>
-              </w:rPr>
-            </w:pPr>
-            <w:r>
-              <w:rPr>
-                <w:rFonts w:ascii="Times New Roman" w:hAnsi="Times New Roman" w:eastAsia="Arial Narrow" w:cs="Times New Roman"/>
-                <w:bCs/>
-                <w:sz w:val="28"/>
-                <w:szCs w:val="28"/>
-              </w:rPr>
-              <w:t>KYA-Energy Group</w:t>
             </w:r>
           </w:p>
         </w:tc>
@@ -527,7 +445,7 @@
                 <w:sz w:val="28"/>
                 <w:szCs w:val="28"/>
               </w:rPr>
-              <w:t>NIF</w:t>
+              <w:t>Dénomination Sociale</w:t>
             </w:r>
           </w:p>
         </w:tc>
@@ -562,7 +480,7 @@
                 <w:sz w:val="28"/>
                 <w:szCs w:val="28"/>
               </w:rPr>
-              <w:t>1000430317</w:t>
+              <w:t>KYA-Energy Group</w:t>
             </w:r>
           </w:p>
         </w:tc>
@@ -611,7 +529,7 @@
                 <w:sz w:val="28"/>
                 <w:szCs w:val="28"/>
               </w:rPr>
-              <w:t>Nom et prénoms du promoteur</w:t>
+              <w:t>NIF</w:t>
             </w:r>
           </w:p>
         </w:tc>
@@ -646,7 +564,7 @@
                 <w:sz w:val="28"/>
                 <w:szCs w:val="28"/>
               </w:rPr>
-              <w:t>AZOUMAH Yao Ketowoglo</w:t>
+              <w:t>1000430317</w:t>
             </w:r>
           </w:p>
         </w:tc>
@@ -695,7 +613,7 @@
                 <w:sz w:val="28"/>
                 <w:szCs w:val="28"/>
               </w:rPr>
-              <w:t>Adresse du promoteur</w:t>
+              <w:t>Nom et prénoms du promoteur</w:t>
             </w:r>
           </w:p>
         </w:tc>
@@ -723,6 +641,7 @@
                 <w:szCs w:val="28"/>
               </w:rPr>
             </w:pPr>
+            <w:bookmarkStart w:id="2" w:name="_GoBack"/>
             <w:r>
               <w:rPr>
                 <w:rFonts w:ascii="Times New Roman" w:hAnsi="Times New Roman" w:eastAsia="Arial Narrow" w:cs="Times New Roman"/>
@@ -730,8 +649,9 @@
                 <w:sz w:val="28"/>
                 <w:szCs w:val="28"/>
               </w:rPr>
-              <w:t>Agoè-Anokui, Tel : +228 91 50 21 49</w:t>
-            </w:r>
+              <w:t>AZOUMAH Yao Ketowoglo</w:t>
+            </w:r>
+            <w:bookmarkEnd w:id="2"/>
           </w:p>
         </w:tc>
       </w:tr>
@@ -779,7 +699,7 @@
                 <w:sz w:val="28"/>
                 <w:szCs w:val="28"/>
               </w:rPr>
-              <w:t>Pays (villes) d’exécution du projet</w:t>
+              <w:t>Adresse du promoteur</w:t>
             </w:r>
           </w:p>
         </w:tc>
@@ -814,7 +734,7 @@
                 <w:sz w:val="28"/>
                 <w:szCs w:val="28"/>
               </w:rPr>
-              <w:t>Zones Afrique et Europe</w:t>
+              <w:t>Agoè-Anokui, Tel : +228 91 50 21 49</w:t>
             </w:r>
           </w:p>
         </w:tc>
@@ -863,7 +783,7 @@
                 <w:sz w:val="28"/>
                 <w:szCs w:val="28"/>
               </w:rPr>
-              <w:t>Durée du projet</w:t>
+              <w:t>Pays (villes) d’exécution du projet</w:t>
             </w:r>
           </w:p>
         </w:tc>
@@ -898,7 +818,7 @@
                 <w:sz w:val="28"/>
                 <w:szCs w:val="28"/>
               </w:rPr>
-              <w:t>5 ans (2026-2030)</w:t>
+              <w:t>Zones Afrique et Europe</w:t>
             </w:r>
           </w:p>
         </w:tc>
@@ -947,7 +867,7 @@
                 <w:sz w:val="28"/>
                 <w:szCs w:val="28"/>
               </w:rPr>
-              <w:t>Début prévisionnel du projet</w:t>
+              <w:t>Durée du projet</w:t>
             </w:r>
           </w:p>
         </w:tc>
@@ -982,7 +902,7 @@
                 <w:sz w:val="28"/>
                 <w:szCs w:val="28"/>
               </w:rPr>
-              <w:t>01/02/2026</w:t>
+              <w:t>5 ans (2026-2030)</w:t>
             </w:r>
           </w:p>
         </w:tc>
@@ -1031,7 +951,7 @@
                 <w:sz w:val="28"/>
                 <w:szCs w:val="28"/>
               </w:rPr>
-              <w:t>Coût total du projet</w:t>
+              <w:t>Début prévisionnel du projet</w:t>
             </w:r>
           </w:p>
         </w:tc>
@@ -1054,30 +974,19 @@
               <w:jc w:val="both"/>
               <w:rPr>
                 <w:rFonts w:ascii="Times New Roman" w:hAnsi="Times New Roman" w:eastAsia="Arial Narrow" w:cs="Times New Roman"/>
+                <w:bCs/>
                 <w:sz w:val="28"/>
                 <w:szCs w:val="28"/>
-                <w:lang w:val="en-GB"/>
-              </w:rPr>
-            </w:pPr>
-            <w:bookmarkStart w:id="2" w:name="_GoBack"/>
+              </w:rPr>
+            </w:pPr>
             <w:r>
               <w:rPr>
                 <w:rFonts w:ascii="Times New Roman" w:hAnsi="Times New Roman" w:eastAsia="Arial Narrow" w:cs="Times New Roman"/>
+                <w:bCs/>
                 <w:sz w:val="28"/>
                 <w:szCs w:val="28"/>
-                <w:lang w:val="en-GB"/>
-              </w:rPr>
-              <w:t>54 800 000</w:t>
-            </w:r>
-            <w:bookmarkEnd w:id="2"/>
-            <w:r>
-              <w:rPr>
-                <w:rFonts w:ascii="Times New Roman" w:hAnsi="Times New Roman" w:eastAsia="Arial Narrow" w:cs="Times New Roman"/>
-                <w:sz w:val="28"/>
-                <w:szCs w:val="28"/>
-                <w:lang w:val="en-GB"/>
-              </w:rPr>
-              <w:t xml:space="preserve"> F CFA</w:t>
+              </w:rPr>
+              <w:t>01/02/2026</w:t>
             </w:r>
           </w:p>
         </w:tc>
@@ -1126,7 +1035,7 @@
                 <w:sz w:val="28"/>
                 <w:szCs w:val="28"/>
               </w:rPr>
-              <w:t>Fonds propre</w:t>
+              <w:t>Coût total du projet</w:t>
             </w:r>
           </w:p>
         </w:tc>
@@ -1149,7 +1058,6 @@
               <w:jc w:val="both"/>
               <w:rPr>
                 <w:rFonts w:ascii="Times New Roman" w:hAnsi="Times New Roman" w:eastAsia="Arial Narrow" w:cs="Times New Roman"/>
-                <w:bCs/>
                 <w:sz w:val="28"/>
                 <w:szCs w:val="28"/>
                 <w:lang w:val="en-GB"/>
@@ -1158,97 +1066,11 @@
             <w:r>
               <w:rPr>
                 <w:rFonts w:ascii="Times New Roman" w:hAnsi="Times New Roman" w:eastAsia="Arial Narrow" w:cs="Times New Roman"/>
-                <w:bCs/>
                 <w:sz w:val="28"/>
                 <w:szCs w:val="28"/>
                 <w:lang w:val="en-GB"/>
               </w:rPr>
-              <w:t xml:space="preserve">16 440 000 F CFA </w:t>
-            </w:r>
-          </w:p>
-        </w:tc>
-      </w:tr>
-      <w:tr>
-        <w:tblPrEx>
-          <w:tblCellMar>
-            <w:top w:w="0" w:type="dxa"/>
-            <w:left w:w="70" w:type="dxa"/>
-            <w:bottom w:w="0" w:type="dxa"/>
-            <w:right w:w="70" w:type="dxa"/>
-          </w:tblCellMar>
-        </w:tblPrEx>
-        <w:trPr>
-          <w:trHeight w:val="741" w:hRule="atLeast"/>
-        </w:trPr>
-        <w:tc>
-          <w:tcPr>
-            <w:tcW w:w="4135" w:type="dxa"/>
-            <w:tcBorders>
-              <w:top w:val="nil"/>
-              <w:left w:val="single" w:color="auto" w:sz="8" w:space="0"/>
-              <w:bottom w:val="single" w:color="auto" w:sz="8" w:space="0"/>
-              <w:right w:val="single" w:color="auto" w:sz="8" w:space="0"/>
-            </w:tcBorders>
-            <w:shd w:val="clear" w:color="auto" w:fill="E2EFD9" w:themeFill="accent6" w:themeFillTint="33"/>
-            <w:noWrap/>
-            <w:vAlign w:val="bottom"/>
-          </w:tcPr>
-          <w:p>
-            <w:pPr>
-              <w:spacing w:after="0" w:line="360" w:lineRule="auto"/>
-              <w:jc w:val="both"/>
-              <w:rPr>
-                <w:rFonts w:ascii="Times New Roman" w:hAnsi="Times New Roman" w:eastAsia="Arial Narrow" w:cs="Times New Roman"/>
-                <w:b/>
-                <w:sz w:val="28"/>
-                <w:szCs w:val="28"/>
-              </w:rPr>
-            </w:pPr>
-            <w:r>
-              <w:rPr>
-                <w:rFonts w:ascii="Times New Roman" w:hAnsi="Times New Roman" w:eastAsia="Arial Narrow" w:cs="Times New Roman"/>
-                <w:b/>
-                <w:sz w:val="28"/>
-                <w:szCs w:val="28"/>
-              </w:rPr>
-              <w:t>Financement recherché (dette)</w:t>
-            </w:r>
-          </w:p>
-        </w:tc>
-        <w:tc>
-          <w:tcPr>
-            <w:tcW w:w="5211" w:type="dxa"/>
-            <w:tcBorders>
-              <w:top w:val="nil"/>
-              <w:left w:val="nil"/>
-              <w:bottom w:val="single" w:color="auto" w:sz="8" w:space="0"/>
-              <w:right w:val="single" w:color="auto" w:sz="8" w:space="0"/>
-            </w:tcBorders>
-            <w:shd w:val="clear" w:color="auto" w:fill="E2EFD9" w:themeFill="accent6" w:themeFillTint="33"/>
-            <w:noWrap/>
-            <w:vAlign w:val="bottom"/>
-          </w:tcPr>
-          <w:p>
-            <w:pPr>
-              <w:spacing w:after="0" w:line="360" w:lineRule="auto"/>
-              <w:jc w:val="both"/>
-              <w:rPr>
-                <w:rFonts w:ascii="Times New Roman" w:hAnsi="Times New Roman" w:eastAsia="Arial Narrow" w:cs="Times New Roman"/>
-                <w:bCs/>
-                <w:sz w:val="28"/>
-                <w:szCs w:val="28"/>
-                <w:lang w:val="en-GB"/>
-              </w:rPr>
-            </w:pPr>
-            <w:r>
-              <w:rPr>
-                <w:rFonts w:ascii="Times New Roman" w:hAnsi="Times New Roman" w:eastAsia="Arial Narrow" w:cs="Times New Roman"/>
-                <w:bCs/>
-                <w:sz w:val="28"/>
-                <w:szCs w:val="28"/>
-                <w:lang w:val="en-GB"/>
-              </w:rPr>
-              <w:t>38 360 000 F CFA</w:t>
+              <w:t>54 800 000 F CFA</w:t>
             </w:r>
           </w:p>
         </w:tc>
@@ -1297,7 +1119,7 @@
                 <w:sz w:val="28"/>
                 <w:szCs w:val="28"/>
               </w:rPr>
-              <w:t>Financement recherché (subvention)</w:t>
+              <w:t>Fonds propre</w:t>
             </w:r>
           </w:p>
         </w:tc>
@@ -1323,6 +1145,7 @@
                 <w:bCs/>
                 <w:sz w:val="28"/>
                 <w:szCs w:val="28"/>
+                <w:lang w:val="en-GB"/>
               </w:rPr>
             </w:pPr>
             <w:r>
@@ -1331,8 +1154,9 @@
                 <w:bCs/>
                 <w:sz w:val="28"/>
                 <w:szCs w:val="28"/>
-              </w:rPr>
-              <w:t>0 F CFA</w:t>
+                <w:lang w:val="en-GB"/>
+              </w:rPr>
+              <w:t xml:space="preserve">16 440 000 F CFA </w:t>
             </w:r>
           </w:p>
         </w:tc>
@@ -1340,6 +1164,175 @@
       <w:tr>
         <w:tblPrEx>
           <w:shd w:val="clear" w:color="auto" w:fill="E2EFD9" w:themeFill="accent6" w:themeFillTint="33"/>
+          <w:tblCellMar>
+            <w:top w:w="0" w:type="dxa"/>
+            <w:left w:w="70" w:type="dxa"/>
+            <w:bottom w:w="0" w:type="dxa"/>
+            <w:right w:w="70" w:type="dxa"/>
+          </w:tblCellMar>
+        </w:tblPrEx>
+        <w:trPr>
+          <w:trHeight w:val="741" w:hRule="atLeast"/>
+        </w:trPr>
+        <w:tc>
+          <w:tcPr>
+            <w:tcW w:w="4135" w:type="dxa"/>
+            <w:tcBorders>
+              <w:top w:val="nil"/>
+              <w:left w:val="single" w:color="auto" w:sz="8" w:space="0"/>
+              <w:bottom w:val="single" w:color="auto" w:sz="8" w:space="0"/>
+              <w:right w:val="single" w:color="auto" w:sz="8" w:space="0"/>
+            </w:tcBorders>
+            <w:shd w:val="clear" w:color="auto" w:fill="E2EFD9" w:themeFill="accent6" w:themeFillTint="33"/>
+            <w:noWrap/>
+            <w:vAlign w:val="bottom"/>
+          </w:tcPr>
+          <w:p>
+            <w:pPr>
+              <w:spacing w:after="0" w:line="360" w:lineRule="auto"/>
+              <w:jc w:val="both"/>
+              <w:rPr>
+                <w:rFonts w:ascii="Times New Roman" w:hAnsi="Times New Roman" w:eastAsia="Arial Narrow" w:cs="Times New Roman"/>
+                <w:b/>
+                <w:sz w:val="28"/>
+                <w:szCs w:val="28"/>
+              </w:rPr>
+            </w:pPr>
+            <w:r>
+              <w:rPr>
+                <w:rFonts w:ascii="Times New Roman" w:hAnsi="Times New Roman" w:eastAsia="Arial Narrow" w:cs="Times New Roman"/>
+                <w:b/>
+                <w:sz w:val="28"/>
+                <w:szCs w:val="28"/>
+              </w:rPr>
+              <w:t>Financement recherché (dette)</w:t>
+            </w:r>
+          </w:p>
+        </w:tc>
+        <w:tc>
+          <w:tcPr>
+            <w:tcW w:w="5211" w:type="dxa"/>
+            <w:tcBorders>
+              <w:top w:val="nil"/>
+              <w:left w:val="nil"/>
+              <w:bottom w:val="single" w:color="auto" w:sz="8" w:space="0"/>
+              <w:right w:val="single" w:color="auto" w:sz="8" w:space="0"/>
+            </w:tcBorders>
+            <w:shd w:val="clear" w:color="auto" w:fill="E2EFD9" w:themeFill="accent6" w:themeFillTint="33"/>
+            <w:noWrap/>
+            <w:vAlign w:val="bottom"/>
+          </w:tcPr>
+          <w:p>
+            <w:pPr>
+              <w:spacing w:after="0" w:line="360" w:lineRule="auto"/>
+              <w:jc w:val="both"/>
+              <w:rPr>
+                <w:rFonts w:ascii="Times New Roman" w:hAnsi="Times New Roman" w:eastAsia="Arial Narrow" w:cs="Times New Roman"/>
+                <w:bCs/>
+                <w:sz w:val="28"/>
+                <w:szCs w:val="28"/>
+                <w:lang w:val="en-GB"/>
+              </w:rPr>
+            </w:pPr>
+            <w:r>
+              <w:rPr>
+                <w:rFonts w:ascii="Times New Roman" w:hAnsi="Times New Roman" w:eastAsia="Arial Narrow" w:cs="Times New Roman"/>
+                <w:bCs/>
+                <w:sz w:val="28"/>
+                <w:szCs w:val="28"/>
+                <w:lang w:val="en-GB"/>
+              </w:rPr>
+              <w:t>38 360 000 F CFA</w:t>
+            </w:r>
+          </w:p>
+        </w:tc>
+      </w:tr>
+      <w:tr>
+        <w:tblPrEx>
+          <w:shd w:val="clear" w:color="auto" w:fill="E2EFD9" w:themeFill="accent6" w:themeFillTint="33"/>
+          <w:tblCellMar>
+            <w:top w:w="0" w:type="dxa"/>
+            <w:left w:w="70" w:type="dxa"/>
+            <w:bottom w:w="0" w:type="dxa"/>
+            <w:right w:w="70" w:type="dxa"/>
+          </w:tblCellMar>
+        </w:tblPrEx>
+        <w:trPr>
+          <w:trHeight w:val="741" w:hRule="atLeast"/>
+        </w:trPr>
+        <w:tc>
+          <w:tcPr>
+            <w:tcW w:w="4135" w:type="dxa"/>
+            <w:tcBorders>
+              <w:top w:val="nil"/>
+              <w:left w:val="single" w:color="auto" w:sz="8" w:space="0"/>
+              <w:bottom w:val="single" w:color="auto" w:sz="8" w:space="0"/>
+              <w:right w:val="single" w:color="auto" w:sz="8" w:space="0"/>
+            </w:tcBorders>
+            <w:shd w:val="clear" w:color="auto" w:fill="E2EFD9" w:themeFill="accent6" w:themeFillTint="33"/>
+            <w:noWrap/>
+            <w:vAlign w:val="bottom"/>
+          </w:tcPr>
+          <w:p>
+            <w:pPr>
+              <w:spacing w:after="0" w:line="360" w:lineRule="auto"/>
+              <w:jc w:val="both"/>
+              <w:rPr>
+                <w:rFonts w:ascii="Times New Roman" w:hAnsi="Times New Roman" w:eastAsia="Arial Narrow" w:cs="Times New Roman"/>
+                <w:b/>
+                <w:sz w:val="28"/>
+                <w:szCs w:val="28"/>
+              </w:rPr>
+            </w:pPr>
+            <w:r>
+              <w:rPr>
+                <w:rFonts w:ascii="Times New Roman" w:hAnsi="Times New Roman" w:eastAsia="Arial Narrow" w:cs="Times New Roman"/>
+                <w:b/>
+                <w:sz w:val="28"/>
+                <w:szCs w:val="28"/>
+              </w:rPr>
+              <w:t>Financement recherché (subvention)</w:t>
+            </w:r>
+          </w:p>
+        </w:tc>
+        <w:tc>
+          <w:tcPr>
+            <w:tcW w:w="5211" w:type="dxa"/>
+            <w:tcBorders>
+              <w:top w:val="nil"/>
+              <w:left w:val="nil"/>
+              <w:bottom w:val="single" w:color="auto" w:sz="8" w:space="0"/>
+              <w:right w:val="single" w:color="auto" w:sz="8" w:space="0"/>
+            </w:tcBorders>
+            <w:shd w:val="clear" w:color="auto" w:fill="E2EFD9" w:themeFill="accent6" w:themeFillTint="33"/>
+            <w:noWrap/>
+            <w:vAlign w:val="bottom"/>
+          </w:tcPr>
+          <w:p>
+            <w:pPr>
+              <w:spacing w:after="0" w:line="360" w:lineRule="auto"/>
+              <w:jc w:val="both"/>
+              <w:rPr>
+                <w:rFonts w:ascii="Times New Roman" w:hAnsi="Times New Roman" w:eastAsia="Arial Narrow" w:cs="Times New Roman"/>
+                <w:bCs/>
+                <w:sz w:val="28"/>
+                <w:szCs w:val="28"/>
+              </w:rPr>
+            </w:pPr>
+            <w:r>
+              <w:rPr>
+                <w:rFonts w:ascii="Times New Roman" w:hAnsi="Times New Roman" w:eastAsia="Arial Narrow" w:cs="Times New Roman"/>
+                <w:bCs/>
+                <w:sz w:val="28"/>
+                <w:szCs w:val="28"/>
+              </w:rPr>
+              <w:t>0 F CFA</w:t>
+            </w:r>
+          </w:p>
+        </w:tc>
+      </w:tr>
+      <w:tr>
+        <w:tblPrEx>
           <w:tblCellMar>
             <w:top w:w="0" w:type="dxa"/>
             <w:left w:w="70" w:type="dxa"/>
@@ -3836,12 +3829,6 @@
             <w:insideH w:val="single" w:color="8EAADB" w:themeColor="accent1" w:themeTint="99" w:sz="4" w:space="0"/>
             <w:insideV w:val="single" w:color="8EAADB" w:themeColor="accent1" w:themeTint="99" w:sz="4" w:space="0"/>
           </w:tblBorders>
-          <w:tblCellMar>
-            <w:top w:w="0" w:type="dxa"/>
-            <w:left w:w="108" w:type="dxa"/>
-            <w:bottom w:w="0" w:type="dxa"/>
-            <w:right w:w="108" w:type="dxa"/>
-          </w:tblCellMar>
         </w:tblPrEx>
         <w:tc>
           <w:tcPr>
@@ -15610,14 +15597,6 @@
       </w:tblGrid>
       <w:tr>
         <w:tblPrEx>
-          <w:tblBorders>
-            <w:top w:val="single" w:color="8EAADB" w:themeColor="accent1" w:themeTint="99" w:sz="4" w:space="0"/>
-            <w:left w:val="single" w:color="8EAADB" w:themeColor="accent1" w:themeTint="99" w:sz="4" w:space="0"/>
-            <w:bottom w:val="single" w:color="8EAADB" w:themeColor="accent1" w:themeTint="99" w:sz="4" w:space="0"/>
-            <w:right w:val="single" w:color="8EAADB" w:themeColor="accent1" w:themeTint="99" w:sz="4" w:space="0"/>
-            <w:insideH w:val="single" w:color="8EAADB" w:themeColor="accent1" w:themeTint="99" w:sz="4" w:space="0"/>
-            <w:insideV w:val="single" w:color="8EAADB" w:themeColor="accent1" w:themeTint="99" w:sz="4" w:space="0"/>
-          </w:tblBorders>
           <w:tblCellMar>
             <w:top w:w="0" w:type="dxa"/>
             <w:left w:w="108" w:type="dxa"/>
@@ -18061,14 +18040,6 @@
       </w:tblGrid>
       <w:tr>
         <w:tblPrEx>
-          <w:tblBorders>
-            <w:top w:val="single" w:color="8EAADB" w:themeColor="accent1" w:themeTint="99" w:sz="4" w:space="0"/>
-            <w:left w:val="single" w:color="8EAADB" w:themeColor="accent1" w:themeTint="99" w:sz="4" w:space="0"/>
-            <w:bottom w:val="single" w:color="8EAADB" w:themeColor="accent1" w:themeTint="99" w:sz="4" w:space="0"/>
-            <w:right w:val="single" w:color="8EAADB" w:themeColor="accent1" w:themeTint="99" w:sz="4" w:space="0"/>
-            <w:insideH w:val="single" w:color="8EAADB" w:themeColor="accent1" w:themeTint="99" w:sz="4" w:space="0"/>
-            <w:insideV w:val="single" w:color="8EAADB" w:themeColor="accent1" w:themeTint="99" w:sz="4" w:space="0"/>
-          </w:tblBorders>
           <w:tblCellMar>
             <w:top w:w="0" w:type="dxa"/>
             <w:left w:w="108" w:type="dxa"/>
@@ -28900,7 +28871,7 @@
       <w:sdtPr>
         <w:id w:val="-468823607"/>
         <w:docPartObj>
-          <w:docPartGallery w:val="AutoText"/>
+          <w:docPartGallery w:val="autotext"/>
         </w:docPartObj>
       </w:sdtPr>
       <w:sdtContent>
@@ -32565,16 +32536,16 @@
     <w:lsdException w:uiPriority="39" w:name="toc 9"/>
     <w:lsdException w:uiPriority="99" w:name="Normal Indent"/>
     <w:lsdException w:uiPriority="99" w:name="footnote text"/>
-    <w:lsdException w:uiPriority="99" w:name="annotation text"/>
-    <w:lsdException w:uiPriority="99" w:semiHidden="0" w:name="header"/>
-    <w:lsdException w:uiPriority="99" w:semiHidden="0" w:name="footer"/>
+    <w:lsdException w:qFormat="1" w:uiPriority="99" w:name="annotation text"/>
+    <w:lsdException w:qFormat="1" w:uiPriority="99" w:semiHidden="0" w:name="header"/>
+    <w:lsdException w:qFormat="1" w:uiPriority="99" w:semiHidden="0" w:name="footer"/>
     <w:lsdException w:uiPriority="99" w:name="index heading"/>
     <w:lsdException w:qFormat="1" w:uiPriority="35" w:semiHidden="0" w:name="caption"/>
     <w:lsdException w:uiPriority="99" w:name="table of figures"/>
     <w:lsdException w:uiPriority="99" w:name="envelope address"/>
     <w:lsdException w:uiPriority="99" w:name="envelope return"/>
     <w:lsdException w:uiPriority="99" w:name="footnote reference"/>
-    <w:lsdException w:uiPriority="99" w:name="annotation reference"/>
+    <w:lsdException w:qFormat="1" w:uiPriority="99" w:name="annotation reference"/>
     <w:lsdException w:uiPriority="99" w:name="line number"/>
     <w:lsdException w:uiPriority="99" w:name="page number"/>
     <w:lsdException w:uiPriority="99" w:name="endnote reference"/>
@@ -32627,7 +32598,7 @@
     <w:lsdException w:uiPriority="99" w:name="Document Map"/>
     <w:lsdException w:uiPriority="99" w:name="Plain Text"/>
     <w:lsdException w:uiPriority="99" w:name="E-mail Signature"/>
-    <w:lsdException w:uiPriority="99" w:name="Normal (Web)"/>
+    <w:lsdException w:qFormat="1" w:uiPriority="99" w:name="Normal (Web)"/>
     <w:lsdException w:uiPriority="99" w:name="HTML Acronym"/>
     <w:lsdException w:uiPriority="99" w:name="HTML Address"/>
     <w:lsdException w:uiPriority="99" w:name="HTML Cite"/>
@@ -32639,9 +32610,9 @@
     <w:lsdException w:uiPriority="99" w:name="HTML Typewriter"/>
     <w:lsdException w:uiPriority="99" w:name="HTML Variable"/>
     <w:lsdException w:qFormat="1" w:uiPriority="99" w:name="Normal Table"/>
-    <w:lsdException w:uiPriority="99" w:name="annotation subject"/>
+    <w:lsdException w:qFormat="1" w:uiPriority="99" w:name="annotation subject"/>
     <w:lsdException w:uiPriority="99" w:name="Balloon Text"/>
-    <w:lsdException w:unhideWhenUsed="0" w:uiPriority="39" w:semiHidden="0" w:name="Table Grid"/>
+    <w:lsdException w:qFormat="1" w:unhideWhenUsed="0" w:uiPriority="39" w:semiHidden="0" w:name="Table Grid"/>
     <w:lsdException w:qFormat="1" w:unhideWhenUsed="0" w:uiPriority="34" w:semiHidden="0" w:name="List Paragraph"/>
     <w:lsdException w:qFormat="1" w:unhideWhenUsed="0" w:uiPriority="29" w:semiHidden="0" w:name="Quote"/>
     <w:lsdException w:qFormat="1" w:unhideWhenUsed="0" w:uiPriority="30" w:semiHidden="0" w:name="Intense Quote"/>
@@ -32916,6 +32887,7 @@
     <w:basedOn w:val="11"/>
     <w:semiHidden/>
     <w:unhideWhenUsed/>
+    <w:qFormat/>
     <w:uiPriority w:val="99"/>
     <w:rPr>
       <w:sz w:val="16"/>
@@ -32952,6 +32924,7 @@
     <w:link w:val="46"/>
     <w:semiHidden/>
     <w:unhideWhenUsed/>
+    <w:qFormat/>
     <w:uiPriority w:val="99"/>
     <w:rPr>
       <w:b/>
@@ -32964,6 +32937,7 @@
     <w:link w:val="45"/>
     <w:semiHidden/>
     <w:unhideWhenUsed/>
+    <w:qFormat/>
     <w:uiPriority w:val="99"/>
     <w:pPr>
       <w:spacing w:line="240" w:lineRule="auto"/>
@@ -33001,6 +32975,7 @@
     <w:basedOn w:val="1"/>
     <w:semiHidden/>
     <w:unhideWhenUsed/>
+    <w:qFormat/>
     <w:uiPriority w:val="99"/>
     <w:pPr>
       <w:spacing w:before="100" w:beforeAutospacing="1" w:after="100" w:afterAutospacing="1" w:line="240" w:lineRule="auto"/>
@@ -33019,6 +32994,7 @@
     <w:basedOn w:val="1"/>
     <w:link w:val="42"/>
     <w:unhideWhenUsed/>
+    <w:qFormat/>
     <w:uiPriority w:val="99"/>
     <w:pPr>
       <w:tabs>
@@ -33033,6 +33009,7 @@
     <w:basedOn w:val="1"/>
     <w:link w:val="41"/>
     <w:unhideWhenUsed/>
+    <w:qFormat/>
     <w:uiPriority w:val="99"/>
     <w:pPr>
       <w:tabs>
@@ -33093,6 +33070,7 @@
     <w:basedOn w:val="11"/>
     <w:link w:val="4"/>
     <w:semiHidden/>
+    <w:qFormat/>
     <w:uiPriority w:val="9"/>
     <w:rPr>
       <w:rFonts w:eastAsiaTheme="majorEastAsia" w:cstheme="majorBidi"/>
@@ -33106,6 +33084,7 @@
     <w:basedOn w:val="11"/>
     <w:link w:val="5"/>
     <w:semiHidden/>
+    <w:qFormat/>
     <w:uiPriority w:val="9"/>
     <w:rPr>
       <w:rFonts w:eastAsiaTheme="majorEastAsia" w:cstheme="majorBidi"/>
@@ -33119,6 +33098,7 @@
     <w:basedOn w:val="11"/>
     <w:link w:val="6"/>
     <w:semiHidden/>
+    <w:qFormat/>
     <w:uiPriority w:val="9"/>
     <w:rPr>
       <w:rFonts w:eastAsiaTheme="majorEastAsia" w:cstheme="majorBidi"/>
@@ -33130,6 +33110,7 @@
     <w:basedOn w:val="11"/>
     <w:link w:val="7"/>
     <w:semiHidden/>
+    <w:qFormat/>
     <w:uiPriority w:val="9"/>
     <w:rPr>
       <w:rFonts w:eastAsiaTheme="majorEastAsia" w:cstheme="majorBidi"/>
@@ -33151,6 +33132,7 @@
     <w:basedOn w:val="11"/>
     <w:link w:val="8"/>
     <w:semiHidden/>
+    <w:qFormat/>
     <w:uiPriority w:val="9"/>
     <w:rPr>
       <w:rFonts w:eastAsiaTheme="majorEastAsia" w:cstheme="majorBidi"/>
@@ -33170,6 +33152,7 @@
     <w:basedOn w:val="11"/>
     <w:link w:val="9"/>
     <w:semiHidden/>
+    <w:qFormat/>
     <w:uiPriority w:val="9"/>
     <w:rPr>
       <w:rFonts w:eastAsiaTheme="majorEastAsia" w:cstheme="majorBidi"/>
@@ -33191,6 +33174,7 @@
     <w:basedOn w:val="11"/>
     <w:link w:val="10"/>
     <w:semiHidden/>
+    <w:qFormat/>
     <w:uiPriority w:val="9"/>
     <w:rPr>
       <w:rFonts w:eastAsiaTheme="majorEastAsia" w:cstheme="majorBidi"/>
@@ -33209,6 +33193,7 @@
     <w:name w:val="Titre Car"/>
     <w:basedOn w:val="11"/>
     <w:link w:val="21"/>
+    <w:qFormat/>
     <w:uiPriority w:val="10"/>
     <w:rPr>
       <w:rFonts w:asciiTheme="majorHAnsi" w:hAnsiTheme="majorHAnsi" w:eastAsiaTheme="majorEastAsia" w:cstheme="majorBidi"/>
@@ -33222,6 +33207,7 @@
     <w:name w:val="Sous-titre Car"/>
     <w:basedOn w:val="11"/>
     <w:link w:val="14"/>
+    <w:qFormat/>
     <w:uiPriority w:val="11"/>
     <w:rPr>
       <w:rFonts w:eastAsiaTheme="majorEastAsia" w:cstheme="majorBidi"/>
@@ -33268,6 +33254,7 @@
     <w:name w:val="Citation Car"/>
     <w:basedOn w:val="11"/>
     <w:link w:val="34"/>
+    <w:qFormat/>
     <w:uiPriority w:val="29"/>
     <w:rPr>
       <w:i/>
@@ -33331,6 +33318,7 @@
     <w:name w:val="Citation intense Car"/>
     <w:basedOn w:val="11"/>
     <w:link w:val="38"/>
+    <w:qFormat/>
     <w:uiPriority w:val="30"/>
     <w:rPr>
       <w:i/>
@@ -33355,17 +33343,20 @@
     <w:name w:val="En-tête Car"/>
     <w:basedOn w:val="11"/>
     <w:link w:val="20"/>
+    <w:qFormat/>
     <w:uiPriority w:val="99"/>
   </w:style>
   <w:style w:type="character" w:customStyle="1" w:styleId="42">
     <w:name w:val="Pied de page Car"/>
     <w:basedOn w:val="11"/>
     <w:link w:val="19"/>
+    <w:qFormat/>
     <w:uiPriority w:val="99"/>
   </w:style>
   <w:style w:type="table" w:styleId="43">
     <w:name w:val="Table Grid"/>
     <w:basedOn w:val="22"/>
+    <w:qFormat/>
     <w:uiPriority w:val="39"/>
     <w:pPr>
       <w:spacing w:after="0" w:line="240" w:lineRule="auto"/>
@@ -33390,6 +33381,7 @@
     <w:name w:val="Revision"/>
     <w:hidden/>
     <w:semiHidden/>
+    <w:qFormat/>
     <w:uiPriority w:val="99"/>
     <w:pPr>
       <w:spacing w:after="0" w:line="240" w:lineRule="auto"/>
@@ -33408,6 +33400,7 @@
     <w:basedOn w:val="11"/>
     <w:link w:val="16"/>
     <w:semiHidden/>
+    <w:qFormat/>
     <w:uiPriority w:val="99"/>
     <w:rPr>
       <w:sz w:val="20"/>
@@ -33419,6 +33412,7 @@
     <w:basedOn w:val="45"/>
     <w:link w:val="15"/>
     <w:semiHidden/>
+    <w:qFormat/>
     <w:uiPriority w:val="99"/>
     <w:rPr>
       <w:b/>
@@ -33430,6 +33424,7 @@
   <w:style w:type="table" w:customStyle="1" w:styleId="47">
     <w:name w:val="Grid Table 4 Accent 1"/>
     <w:basedOn w:val="22"/>
+    <w:qFormat/>
     <w:uiPriority w:val="49"/>
     <w:pPr>
       <w:spacing w:after="0" w:line="240" w:lineRule="auto"/>
@@ -33504,6 +33499,7 @@
   <w:style w:type="table" w:customStyle="1" w:styleId="48">
     <w:name w:val="Tableau Grille 4 - Accentuation 11"/>
     <w:basedOn w:val="22"/>
+    <w:qFormat/>
     <w:uiPriority w:val="49"/>
     <w:pPr>
       <w:spacing w:after="0" w:line="240" w:lineRule="auto"/>

</xml_diff>